<commit_message>
added 1 table (supp online-only), adjusted manuscript before FA review. still need cover letter
</commit_message>
<xml_diff>
--- a/Final_phase_Article/output/tables/Table_1_Assessment_surgical_RCTs_clinical_practice_april27correction.docx
+++ b/Final_phase_Article/output/tables/Table_1_Assessment_surgical_RCTs_clinical_practice_april27correction.docx
@@ -766,7 +766,7 @@
                 <w:szCs w:val="22"/>
                 <w:color w:val="000000"/>
               </w:rPr>
-              <w:t xml:space="preserve">73 (86.9%)</w:t>
+              <w:t xml:space="preserve">76 (87.4%)</w:t>
             </w:r>
           </w:p>
         </w:tc>
@@ -1106,7 +1106,7 @@
                 <w:szCs w:val="22"/>
                 <w:color w:val="000000"/>
               </w:rPr>
-              <w:t xml:space="preserve">11 (13.1%)</w:t>
+              <w:t xml:space="preserve">11 (12.6%)</w:t>
             </w:r>
           </w:p>
         </w:tc>
@@ -1446,7 +1446,7 @@
                 <w:szCs w:val="22"/>
                 <w:color w:val="000000"/>
               </w:rPr>
-              <w:t xml:space="preserve">37 (44.0%)</w:t>
+              <w:t xml:space="preserve">37 (42.5%)</w:t>
             </w:r>
           </w:p>
         </w:tc>
@@ -1616,7 +1616,7 @@
                 <w:szCs w:val="22"/>
                 <w:color w:val="000000"/>
               </w:rPr>
-              <w:t xml:space="preserve">1 (1.2%)</w:t>
+              <w:t xml:space="preserve">2 (2.3%)</w:t>
             </w:r>
           </w:p>
         </w:tc>
@@ -1786,7 +1786,7 @@
                 <w:szCs w:val="22"/>
                 <w:color w:val="000000"/>
               </w:rPr>
-              <w:t xml:space="preserve">2 (2.4%)</w:t>
+              <w:t xml:space="preserve">2 (2.3%)</w:t>
             </w:r>
           </w:p>
         </w:tc>
@@ -1956,7 +1956,7 @@
                 <w:szCs w:val="22"/>
                 <w:color w:val="000000"/>
               </w:rPr>
-              <w:t xml:space="preserve">44 (52.4%)</w:t>
+              <w:t xml:space="preserve">46 (52.9%)</w:t>
             </w:r>
           </w:p>
         </w:tc>
@@ -2296,7 +2296,7 @@
                 <w:szCs w:val="22"/>
                 <w:color w:val="000000"/>
               </w:rPr>
-              <w:t xml:space="preserve">9 (10.8%)</w:t>
+              <w:t xml:space="preserve">9 (10.3%)</w:t>
             </w:r>
           </w:p>
         </w:tc>
@@ -2466,7 +2466,7 @@
                 <w:szCs w:val="22"/>
                 <w:color w:val="000000"/>
               </w:rPr>
-              <w:t xml:space="preserve">65 (78.3%)</w:t>
+              <w:t xml:space="preserve">69 (79.3%)</w:t>
             </w:r>
           </w:p>
         </w:tc>
@@ -2636,7 +2636,7 @@
                 <w:szCs w:val="22"/>
                 <w:color w:val="000000"/>
               </w:rPr>
-              <w:t xml:space="preserve">9 (10.8%)</w:t>
+              <w:t xml:space="preserve">9 (10.3%)</w:t>
             </w:r>
           </w:p>
         </w:tc>

</xml_diff>